<commit_message>
v0.2.9 - Sprint 4 - dashboard tasques amb grups - pin admin
</commit_message>
<xml_diff>
--- a/@@@@dfu.docx
+++ b/@@@@dfu.docx
@@ -18361,7 +18361,397 @@
         <w:t xml:space="preserve"> -r requirements.txt</w:t>
       </w:r>
     </w:p>
+    <w:p>
+      <w:proofErr w:type="spellStart"/>
+      <w:r>
+        <w:rPr>
+          <w:highlight w:val="yellow"/>
+        </w:rPr>
+        <w:t>executa</w:t>
+      </w:r>
+      <w:proofErr w:type="spellEnd"/>
+      <w:r>
+        <w:rPr>
+          <w:highlight w:val="yellow"/>
+        </w:rPr>
+        <w:t xml:space="preserve"> </w:t>
+      </w:r>
+      <w:proofErr w:type="spellStart"/>
+      <w:r>
+        <w:rPr>
+          <w:highlight w:val="yellow"/>
+        </w:rPr>
+        <w:t>githup</w:t>
+      </w:r>
+      <w:proofErr w:type="spellEnd"/>
+      <w:r>
+        <w:rPr>
+          <w:highlight w:val="yellow"/>
+        </w:rPr>
+        <w:t xml:space="preserve"> i conecta</w:t>
+      </w:r>
+    </w:p>
+    <w:p>
+      <w:proofErr w:type="spellStart"/>
+      <w:r>
+        <w:t>github</w:t>
+      </w:r>
+      <w:proofErr w:type="spellEnd"/>
+      <w:r>
+        <w:t xml:space="preserve"> </w:t>
+      </w:r>
+      <w:proofErr w:type="spellStart"/>
+      <w:r>
+        <w:t>cmd</w:t>
+      </w:r>
+      <w:proofErr w:type="spellEnd"/>
+    </w:p>
+    <w:p>
+      <w:r>
+        <w:t>d:</w:t>
+      </w:r>
+    </w:p>
+    <w:p>
+      <w:pPr>
+        <w:tabs>
+          <w:tab w:val="left" w:pos="916"/>
+          <w:tab w:val="left" w:pos="1832"/>
+          <w:tab w:val="left" w:pos="2748"/>
+          <w:tab w:val="left" w:pos="3664"/>
+          <w:tab w:val="left" w:pos="4580"/>
+          <w:tab w:val="left" w:pos="5496"/>
+          <w:tab w:val="left" w:pos="6412"/>
+          <w:tab w:val="left" w:pos="7328"/>
+          <w:tab w:val="left" w:pos="8244"/>
+          <w:tab w:val="left" w:pos="9160"/>
+          <w:tab w:val="left" w:pos="10076"/>
+          <w:tab w:val="left" w:pos="10992"/>
+          <w:tab w:val="left" w:pos="11908"/>
+          <w:tab w:val="left" w:pos="12824"/>
+          <w:tab w:val="left" w:pos="13740"/>
+          <w:tab w:val="left" w:pos="14656"/>
+        </w:tabs>
+        <w:spacing w:after="0" w:line="240" w:lineRule="auto"/>
+        <w:rPr>
+          <w:rFonts w:ascii="Courier New" w:eastAsia="Times New Roman" w:hAnsi="Courier New" w:cs="Courier New"/>
+          <w:sz w:val="20"/>
+          <w:szCs w:val="20"/>
+          <w:lang w:eastAsia="es-ES"/>
+        </w:rPr>
+      </w:pPr>
+      <w:r>
+        <w:rPr>
+          <w:rFonts w:ascii="Courier New" w:eastAsia="Times New Roman" w:hAnsi="Courier New" w:cs="Courier New"/>
+          <w:sz w:val="20"/>
+          <w:szCs w:val="20"/>
+          <w:lang w:eastAsia="es-ES"/>
+        </w:rPr>
+        <w:t>cd /d D:\</w:t>
+      </w:r>
+      <w:r>
+        <w:rPr>
+          <w:rFonts w:ascii="Courier New" w:eastAsia="Times New Roman" w:hAnsi="Courier New" w:cs="Courier New"/>
+          <w:sz w:val="20"/>
+          <w:szCs w:val="20"/>
+          <w:lang w:eastAsia="es-ES"/>
+        </w:rPr>
+        <w:t>sistemes\</w:t>
+      </w:r>
+      <w:r>
+        <w:rPr>
+          <w:rFonts w:ascii="Courier New" w:eastAsia="Times New Roman" w:hAnsi="Courier New" w:cs="Courier New"/>
+          <w:sz w:val="20"/>
+          <w:szCs w:val="20"/>
+          <w:lang w:eastAsia="es-ES"/>
+        </w:rPr>
+        <w:t>missions</w:t>
+      </w:r>
+    </w:p>
+    <w:p>
+      <w:pPr>
+        <w:tabs>
+          <w:tab w:val="left" w:pos="916"/>
+          <w:tab w:val="left" w:pos="1832"/>
+          <w:tab w:val="left" w:pos="2748"/>
+          <w:tab w:val="left" w:pos="3664"/>
+          <w:tab w:val="left" w:pos="4580"/>
+          <w:tab w:val="left" w:pos="5496"/>
+          <w:tab w:val="left" w:pos="6412"/>
+          <w:tab w:val="left" w:pos="7328"/>
+          <w:tab w:val="left" w:pos="8244"/>
+          <w:tab w:val="left" w:pos="9160"/>
+          <w:tab w:val="left" w:pos="10076"/>
+          <w:tab w:val="left" w:pos="10992"/>
+          <w:tab w:val="left" w:pos="11908"/>
+          <w:tab w:val="left" w:pos="12824"/>
+          <w:tab w:val="left" w:pos="13740"/>
+          <w:tab w:val="left" w:pos="14656"/>
+        </w:tabs>
+        <w:spacing w:after="0" w:line="240" w:lineRule="auto"/>
+        <w:rPr>
+          <w:rFonts w:ascii="Courier New" w:eastAsia="Times New Roman" w:hAnsi="Courier New" w:cs="Courier New"/>
+          <w:sz w:val="20"/>
+          <w:szCs w:val="20"/>
+          <w:lang w:eastAsia="es-ES"/>
+        </w:rPr>
+      </w:pPr>
+      <w:proofErr w:type="spellStart"/>
+      <w:r>
+        <w:rPr>
+          <w:rFonts w:ascii="Courier New" w:eastAsia="Times New Roman" w:hAnsi="Courier New" w:cs="Courier New"/>
+          <w:sz w:val="20"/>
+          <w:szCs w:val="20"/>
+          <w:lang w:eastAsia="es-ES"/>
+        </w:rPr>
+        <w:t>git</w:t>
+      </w:r>
+      <w:proofErr w:type="spellEnd"/>
+      <w:r>
+        <w:rPr>
+          <w:rFonts w:ascii="Courier New" w:eastAsia="Times New Roman" w:hAnsi="Courier New" w:cs="Courier New"/>
+          <w:sz w:val="20"/>
+          <w:szCs w:val="20"/>
+          <w:lang w:eastAsia="es-ES"/>
+        </w:rPr>
+        <w:t xml:space="preserve"> </w:t>
+      </w:r>
+      <w:proofErr w:type="spellStart"/>
+      <w:r>
+        <w:rPr>
+          <w:rFonts w:ascii="Courier New" w:eastAsia="Times New Roman" w:hAnsi="Courier New" w:cs="Courier New"/>
+          <w:sz w:val="20"/>
+          <w:szCs w:val="20"/>
+          <w:lang w:eastAsia="es-ES"/>
+        </w:rPr>
+        <w:t>init</w:t>
+      </w:r>
+      <w:proofErr w:type="spellEnd"/>
+    </w:p>
+    <w:p>
+      <w:pPr>
+        <w:tabs>
+          <w:tab w:val="left" w:pos="916"/>
+          <w:tab w:val="left" w:pos="1832"/>
+          <w:tab w:val="left" w:pos="2748"/>
+          <w:tab w:val="left" w:pos="3664"/>
+          <w:tab w:val="left" w:pos="4580"/>
+          <w:tab w:val="left" w:pos="5496"/>
+          <w:tab w:val="left" w:pos="6412"/>
+          <w:tab w:val="left" w:pos="7328"/>
+          <w:tab w:val="left" w:pos="8244"/>
+          <w:tab w:val="left" w:pos="9160"/>
+          <w:tab w:val="left" w:pos="10076"/>
+          <w:tab w:val="left" w:pos="10992"/>
+          <w:tab w:val="left" w:pos="11908"/>
+          <w:tab w:val="left" w:pos="12824"/>
+          <w:tab w:val="left" w:pos="13740"/>
+          <w:tab w:val="left" w:pos="14656"/>
+        </w:tabs>
+        <w:spacing w:after="0" w:line="240" w:lineRule="auto"/>
+        <w:rPr>
+          <w:rFonts w:ascii="Courier New" w:eastAsia="Times New Roman" w:hAnsi="Courier New" w:cs="Courier New"/>
+          <w:sz w:val="20"/>
+          <w:szCs w:val="20"/>
+          <w:lang w:eastAsia="es-ES"/>
+        </w:rPr>
+      </w:pPr>
+      <w:proofErr w:type="spellStart"/>
+      <w:r>
+        <w:rPr>
+          <w:rFonts w:ascii="Courier New" w:eastAsia="Times New Roman" w:hAnsi="Courier New" w:cs="Courier New"/>
+          <w:sz w:val="20"/>
+          <w:szCs w:val="20"/>
+          <w:lang w:eastAsia="es-ES"/>
+        </w:rPr>
+        <w:t>git</w:t>
+      </w:r>
+      <w:proofErr w:type="spellEnd"/>
+      <w:r>
+        <w:rPr>
+          <w:rFonts w:ascii="Courier New" w:eastAsia="Times New Roman" w:hAnsi="Courier New" w:cs="Courier New"/>
+          <w:sz w:val="20"/>
+          <w:szCs w:val="20"/>
+          <w:lang w:eastAsia="es-ES"/>
+        </w:rPr>
+        <w:t xml:space="preserve"> </w:t>
+      </w:r>
+      <w:proofErr w:type="spellStart"/>
+      <w:proofErr w:type="gramStart"/>
+      <w:r>
+        <w:rPr>
+          <w:rFonts w:ascii="Courier New" w:eastAsia="Times New Roman" w:hAnsi="Courier New" w:cs="Courier New"/>
+          <w:sz w:val="20"/>
+          <w:szCs w:val="20"/>
+          <w:lang w:eastAsia="es-ES"/>
+        </w:rPr>
+        <w:t>add</w:t>
+      </w:r>
+      <w:proofErr w:type="spellEnd"/>
+      <w:r>
+        <w:rPr>
+          <w:rFonts w:ascii="Courier New" w:eastAsia="Times New Roman" w:hAnsi="Courier New" w:cs="Courier New"/>
+          <w:sz w:val="20"/>
+          <w:szCs w:val="20"/>
+          <w:lang w:eastAsia="es-ES"/>
+        </w:rPr>
+        <w:t xml:space="preserve"> .</w:t>
+      </w:r>
+      <w:proofErr w:type="gramEnd"/>
+    </w:p>
+    <w:p>
+      <w:pPr>
+        <w:tabs>
+          <w:tab w:val="left" w:pos="916"/>
+          <w:tab w:val="left" w:pos="1832"/>
+          <w:tab w:val="left" w:pos="2748"/>
+          <w:tab w:val="left" w:pos="3664"/>
+          <w:tab w:val="left" w:pos="4580"/>
+          <w:tab w:val="left" w:pos="5496"/>
+          <w:tab w:val="left" w:pos="6412"/>
+          <w:tab w:val="left" w:pos="7328"/>
+          <w:tab w:val="left" w:pos="8244"/>
+          <w:tab w:val="left" w:pos="9160"/>
+          <w:tab w:val="left" w:pos="10076"/>
+          <w:tab w:val="left" w:pos="10992"/>
+          <w:tab w:val="left" w:pos="11908"/>
+          <w:tab w:val="left" w:pos="12824"/>
+          <w:tab w:val="left" w:pos="13740"/>
+          <w:tab w:val="left" w:pos="14656"/>
+        </w:tabs>
+        <w:spacing w:after="0" w:line="240" w:lineRule="auto"/>
+        <w:rPr>
+          <w:rFonts w:ascii="Courier New" w:eastAsia="Times New Roman" w:hAnsi="Courier New" w:cs="Courier New"/>
+          <w:sz w:val="20"/>
+          <w:szCs w:val="20"/>
+          <w:lang w:eastAsia="es-ES"/>
+        </w:rPr>
+      </w:pPr>
+      <w:proofErr w:type="spellStart"/>
+      <w:r>
+        <w:rPr>
+          <w:rFonts w:ascii="Courier New" w:eastAsia="Times New Roman" w:hAnsi="Courier New" w:cs="Courier New"/>
+          <w:sz w:val="20"/>
+          <w:szCs w:val="20"/>
+          <w:lang w:eastAsia="es-ES"/>
+        </w:rPr>
+        <w:t>git</w:t>
+      </w:r>
+      <w:proofErr w:type="spellEnd"/>
+      <w:r>
+        <w:rPr>
+          <w:rFonts w:ascii="Courier New" w:eastAsia="Times New Roman" w:hAnsi="Courier New" w:cs="Courier New"/>
+          <w:sz w:val="20"/>
+          <w:szCs w:val="20"/>
+          <w:lang w:eastAsia="es-ES"/>
+        </w:rPr>
+        <w:t xml:space="preserve"> </w:t>
+      </w:r>
+      <w:proofErr w:type="spellStart"/>
+      <w:r>
+        <w:rPr>
+          <w:rFonts w:ascii="Courier New" w:eastAsia="Times New Roman" w:hAnsi="Courier New" w:cs="Courier New"/>
+          <w:sz w:val="20"/>
+          <w:szCs w:val="20"/>
+          <w:lang w:eastAsia="es-ES"/>
+        </w:rPr>
+        <w:t>commit</w:t>
+      </w:r>
+      <w:proofErr w:type="spellEnd"/>
+      <w:r>
+        <w:rPr>
+          <w:rFonts w:ascii="Courier New" w:eastAsia="Times New Roman" w:hAnsi="Courier New" w:cs="Courier New"/>
+          <w:sz w:val="20"/>
+          <w:szCs w:val="20"/>
+          <w:lang w:eastAsia="es-ES"/>
+        </w:rPr>
+        <w:t xml:space="preserve"> -m "</w:t>
+      </w:r>
+      <w:proofErr w:type="spellStart"/>
+      <w:r>
+        <w:rPr>
+          <w:rFonts w:ascii="Courier New" w:eastAsia="Times New Roman" w:hAnsi="Courier New" w:cs="Courier New"/>
+          <w:sz w:val="20"/>
+          <w:szCs w:val="20"/>
+          <w:lang w:eastAsia="es-ES"/>
+        </w:rPr>
+        <w:t>Missatge</w:t>
+      </w:r>
+      <w:proofErr w:type="spellEnd"/>
+      <w:r>
+        <w:rPr>
+          <w:rFonts w:ascii="Courier New" w:eastAsia="Times New Roman" w:hAnsi="Courier New" w:cs="Courier New"/>
+          <w:sz w:val="20"/>
+          <w:szCs w:val="20"/>
+          <w:lang w:eastAsia="es-ES"/>
+        </w:rPr>
+        <w:t>"</w:t>
+      </w:r>
+    </w:p>
+    <w:p>
+      <w:pPr>
+        <w:tabs>
+          <w:tab w:val="left" w:pos="916"/>
+          <w:tab w:val="left" w:pos="1832"/>
+          <w:tab w:val="left" w:pos="2748"/>
+          <w:tab w:val="left" w:pos="3664"/>
+          <w:tab w:val="left" w:pos="4580"/>
+          <w:tab w:val="left" w:pos="5496"/>
+          <w:tab w:val="left" w:pos="6412"/>
+          <w:tab w:val="left" w:pos="7328"/>
+          <w:tab w:val="left" w:pos="8244"/>
+          <w:tab w:val="left" w:pos="9160"/>
+          <w:tab w:val="left" w:pos="10076"/>
+          <w:tab w:val="left" w:pos="10992"/>
+          <w:tab w:val="left" w:pos="11908"/>
+          <w:tab w:val="left" w:pos="12824"/>
+          <w:tab w:val="left" w:pos="13740"/>
+          <w:tab w:val="left" w:pos="14656"/>
+        </w:tabs>
+        <w:spacing w:after="0" w:line="240" w:lineRule="auto"/>
+        <w:rPr>
+          <w:rFonts w:ascii="Courier New" w:eastAsia="Times New Roman" w:hAnsi="Courier New" w:cs="Courier New"/>
+          <w:sz w:val="20"/>
+          <w:szCs w:val="20"/>
+          <w:lang w:eastAsia="es-ES"/>
+        </w:rPr>
+      </w:pPr>
+      <w:bookmarkStart w:id="0" w:name="_GoBack"/>
+      <w:proofErr w:type="spellStart"/>
+      <w:r>
+        <w:rPr>
+          <w:rFonts w:ascii="Courier New" w:eastAsia="Times New Roman" w:hAnsi="Courier New" w:cs="Courier New"/>
+          <w:sz w:val="20"/>
+          <w:szCs w:val="20"/>
+          <w:lang w:eastAsia="es-ES"/>
+        </w:rPr>
+        <w:t>git</w:t>
+      </w:r>
+      <w:proofErr w:type="spellEnd"/>
+      <w:r>
+        <w:rPr>
+          <w:rFonts w:ascii="Courier New" w:eastAsia="Times New Roman" w:hAnsi="Courier New" w:cs="Courier New"/>
+          <w:sz w:val="20"/>
+          <w:szCs w:val="20"/>
+          <w:lang w:eastAsia="es-ES"/>
+        </w:rPr>
+        <w:t xml:space="preserve"> </w:t>
+      </w:r>
+      <w:proofErr w:type="spellStart"/>
+      <w:r>
+        <w:rPr>
+          <w:rFonts w:ascii="Courier New" w:eastAsia="Times New Roman" w:hAnsi="Courier New" w:cs="Courier New"/>
+          <w:sz w:val="20"/>
+          <w:szCs w:val="20"/>
+          <w:lang w:eastAsia="es-ES"/>
+        </w:rPr>
+        <w:t>push</w:t>
+      </w:r>
+      <w:proofErr w:type="spellEnd"/>
+    </w:p>
+    <w:bookmarkEnd w:id="0"/>
     <w:p/>
+    <w:p/>
+    <w:p/>
     <w:p>
       <w:proofErr w:type="spellStart"/>
       <w:r>
@@ -18465,8 +18855,6 @@
       <w:pPr>
         <w:ind w:firstLine="708"/>
       </w:pPr>
-      <w:bookmarkStart w:id="0" w:name="_GoBack"/>
-      <w:bookmarkEnd w:id="0"/>
       <w:r>
         <w:t>http://127.0.0.1:5000/ui</w:t>
       </w:r>

</xml_diff>